<commit_message>
Add presentation transcript PDF to submission directory
</commit_message>
<xml_diff>
--- a/ADC2026_ImplementationBrief_v2.docx
+++ b/ADC2026_ImplementationBrief_v2.docx
@@ -300,7 +300,7 @@
                 <w:sz w:val="20"/>
                 <w:szCs w:val="20"/>
               </w:rPr>
-              <w:t xml:space="preserve">E Don Kast infrastructure, Claude Vision pipeline, API integrations</w:t>
+              <w:t xml:space="preserve">E Don Kast infrastructure, machine learning OCR pipeline, API integrations</w:t>
             </w:r>
           </w:p>
         </w:tc>
@@ -938,7 +938,7 @@
                 <w:sz w:val="20"/>
                 <w:szCs w:val="20"/>
               </w:rPr>
-              <w:t xml:space="preserve">Claude Vision API (Haiku, 50k forms)</w:t>
+              <w:t xml:space="preserve">AI API (Haiku, 50k forms)</w:t>
             </w:r>
           </w:p>
         </w:tc>
@@ -2844,7 +2844,7 @@
                 <w:sz w:val="20"/>
                 <w:szCs w:val="20"/>
               </w:rPr>
-              <w:t xml:space="preserve">Form image quality too low for AI extraction</w:t>
+              <w:t xml:space="preserve">Form image quality too low for neural network inference</w:t>
             </w:r>
           </w:p>
         </w:tc>

</xml_diff>